<commit_message>
Carga de informe. Presentacion de EGB v1.
</commit_message>
<xml_diff>
--- a/2_egb/1_informes/EGB_512_G4_Informe - Carga electronica.docx
+++ b/2_egb/1_informes/EGB_512_G4_Informe - Carga electronica.docx
@@ -1727,8 +1727,9 @@
           <w:sz w:val="18"/>
           <w:szCs w:val="20"/>
         </w:rPr>
-        <w:t xml:space="preserve"> y un sistema operativo de propósito general GPOS (EGB), mediante el diseño e implementación de un driver de kernel en Linux.</w:t>
-      </w:r>
+        <w:t xml:space="preserve"> y un sistema operativo de propósito general GPOS (EGB), mediante el diseño e implementación de un </w:t>
+      </w:r>
+      <w:proofErr w:type="gramStart"/>
       <w:r>
         <w:rPr>
           <w:rFonts w:ascii="Arial" w:hAnsi="Arial" w:cs="Arial"/>
@@ -1737,8 +1738,9 @@
           <w:sz w:val="18"/>
           <w:szCs w:val="20"/>
         </w:rPr>
-        <w:t xml:space="preserve"> </w:t>
-      </w:r>
+        <w:t>driver</w:t>
+      </w:r>
+      <w:proofErr w:type="gramEnd"/>
       <w:r>
         <w:rPr>
           <w:rFonts w:ascii="Arial" w:hAnsi="Arial" w:cs="Arial"/>
@@ -1746,10 +1748,10 @@
           <w:color w:val="000000"/>
           <w:sz w:val="18"/>
           <w:szCs w:val="20"/>
-          <w:lang w:val="es-AR"/>
-        </w:rPr>
-        <w:t xml:space="preserve">El trabajo </w:t>
-      </w:r>
+        </w:rPr>
+        <w:t xml:space="preserve"> de </w:t>
+      </w:r>
+      <w:proofErr w:type="spellStart"/>
       <w:r>
         <w:rPr>
           <w:rFonts w:ascii="Arial" w:hAnsi="Arial" w:cs="Arial"/>
@@ -1757,10 +1759,10 @@
           <w:color w:val="000000"/>
           <w:sz w:val="18"/>
           <w:szCs w:val="20"/>
-          <w:lang w:val="es-AR"/>
-        </w:rPr>
-        <w:t>consiste</w:t>
-      </w:r>
+        </w:rPr>
+        <w:t>kernel</w:t>
+      </w:r>
+      <w:proofErr w:type="spellEnd"/>
       <w:r>
         <w:rPr>
           <w:rFonts w:ascii="Arial" w:hAnsi="Arial" w:cs="Arial"/>
@@ -1768,9 +1770,8 @@
           <w:color w:val="000000"/>
           <w:sz w:val="18"/>
           <w:szCs w:val="20"/>
-          <w:lang w:val="es-AR"/>
-        </w:rPr>
-        <w:t xml:space="preserve"> en la creación de un módulo de kernel que implementa una interfaz de tipo char device y que, a su vez, utiliza la capa serdev para la comunicación serie sobre UART con el dispositivo embebido. El driver desarrollado permite el envío y recepción de comandos desde el espacio de usuario</w:t>
+        </w:rPr>
+        <w:t xml:space="preserve"> en Linux.</w:t>
       </w:r>
       <w:r>
         <w:rPr>
@@ -1779,9 +1780,8 @@
           <w:color w:val="000000"/>
           <w:sz w:val="18"/>
           <w:szCs w:val="20"/>
-          <w:lang w:val="es-AR"/>
-        </w:rPr>
-        <w:t xml:space="preserve"> (User Space), tanto en una aplicación de comandos CLI como en una aplicación </w:t>
+        </w:rPr>
+        <w:t xml:space="preserve"> </w:t>
       </w:r>
       <w:r>
         <w:rPr>
@@ -1792,7 +1792,7 @@
           <w:szCs w:val="20"/>
           <w:lang w:val="es-AR"/>
         </w:rPr>
-        <w:t xml:space="preserve">web GUI. </w:t>
+        <w:t xml:space="preserve">El trabajo </w:t>
       </w:r>
       <w:r>
         <w:rPr>
@@ -1801,8 +1801,9 @@
           <w:color w:val="000000"/>
           <w:sz w:val="18"/>
           <w:szCs w:val="20"/>
-        </w:rPr>
-        <w:t xml:space="preserve">El driver fue programado </w:t>
+          <w:lang w:val="es-AR"/>
+        </w:rPr>
+        <w:t>consiste</w:t>
       </w:r>
       <w:r>
         <w:rPr>
@@ -1811,9 +1812,11 @@
           <w:color w:val="000000"/>
           <w:sz w:val="18"/>
           <w:szCs w:val="20"/>
-        </w:rPr>
-        <w:t>sobre el IDE Visual Studio</w:t>
-      </w:r>
+          <w:lang w:val="es-AR"/>
+        </w:rPr>
+        <w:t xml:space="preserve"> en la creación de un módulo de </w:t>
+      </w:r>
+      <w:proofErr w:type="spellStart"/>
       <w:r>
         <w:rPr>
           <w:rFonts w:ascii="Arial" w:hAnsi="Arial" w:cs="Arial"/>
@@ -1821,9 +1824,11 @@
           <w:color w:val="000000"/>
           <w:sz w:val="18"/>
           <w:szCs w:val="20"/>
-        </w:rPr>
-        <w:t xml:space="preserve"> Code en lenguaje C, y la aplicación de </w:t>
-      </w:r>
+          <w:lang w:val="es-AR"/>
+        </w:rPr>
+        <w:t>kernel</w:t>
+      </w:r>
+      <w:proofErr w:type="spellEnd"/>
       <w:r>
         <w:rPr>
           <w:rFonts w:ascii="Arial" w:hAnsi="Arial" w:cs="Arial"/>
@@ -1831,9 +1836,11 @@
           <w:color w:val="000000"/>
           <w:sz w:val="18"/>
           <w:szCs w:val="20"/>
-        </w:rPr>
-        <w:t xml:space="preserve">User Space </w:t>
-      </w:r>
+          <w:lang w:val="es-AR"/>
+        </w:rPr>
+        <w:t xml:space="preserve"> que implementa una interfaz de tipo char device y que, a su vez, utiliza la capa </w:t>
+      </w:r>
+      <w:proofErr w:type="spellStart"/>
       <w:r>
         <w:rPr>
           <w:rFonts w:ascii="Arial" w:hAnsi="Arial" w:cs="Arial"/>
@@ -1841,9 +1848,11 @@
           <w:color w:val="000000"/>
           <w:sz w:val="18"/>
           <w:szCs w:val="20"/>
-        </w:rPr>
-        <w:t>programada en Python, HTML, CSS y Javascript</w:t>
-      </w:r>
+          <w:lang w:val="es-AR"/>
+        </w:rPr>
+        <w:t>serdev</w:t>
+      </w:r>
+      <w:proofErr w:type="spellEnd"/>
       <w:r>
         <w:rPr>
           <w:rFonts w:ascii="Arial" w:hAnsi="Arial" w:cs="Arial"/>
@@ -1851,9 +1860,11 @@
           <w:color w:val="000000"/>
           <w:sz w:val="18"/>
           <w:szCs w:val="20"/>
-        </w:rPr>
-        <w:t xml:space="preserve">. </w:t>
-      </w:r>
+          <w:lang w:val="es-AR"/>
+        </w:rPr>
+        <w:t xml:space="preserve"> para la comunicación serie sobre UART con el dispositivo embebido. El </w:t>
+      </w:r>
+      <w:proofErr w:type="gramStart"/>
       <w:r>
         <w:rPr>
           <w:rFonts w:ascii="Arial" w:hAnsi="Arial" w:cs="Arial"/>
@@ -1863,8 +1874,9 @@
           <w:szCs w:val="20"/>
           <w:lang w:val="es-AR"/>
         </w:rPr>
-        <w:t xml:space="preserve">El sistema </w:t>
-      </w:r>
+        <w:t>driver</w:t>
+      </w:r>
+      <w:proofErr w:type="gramEnd"/>
       <w:r>
         <w:rPr>
           <w:rFonts w:ascii="Arial" w:hAnsi="Arial" w:cs="Arial"/>
@@ -1874,7 +1886,7 @@
           <w:szCs w:val="20"/>
           <w:lang w:val="es-AR"/>
         </w:rPr>
-        <w:t xml:space="preserve">permitirá </w:t>
+        <w:t xml:space="preserve"> desarrollado permite el envío y recepción de comandos desde el espacio de usuario</w:t>
       </w:r>
       <w:r>
         <w:rPr>
@@ -1883,9 +1895,11 @@
           <w:color w:val="000000"/>
           <w:sz w:val="18"/>
           <w:szCs w:val="20"/>
-        </w:rPr>
-        <w:t xml:space="preserve">la lectura y modificación de parámetros </w:t>
-      </w:r>
+          <w:lang w:val="es-AR"/>
+        </w:rPr>
+        <w:t xml:space="preserve"> (</w:t>
+      </w:r>
+      <w:proofErr w:type="spellStart"/>
       <w:r>
         <w:rPr>
           <w:rFonts w:ascii="Arial" w:hAnsi="Arial" w:cs="Arial"/>
@@ -1893,9 +1907,11 @@
           <w:color w:val="000000"/>
           <w:sz w:val="18"/>
           <w:szCs w:val="20"/>
-        </w:rPr>
-        <w:t>del</w:t>
-      </w:r>
+          <w:lang w:val="es-AR"/>
+        </w:rPr>
+        <w:t>User</w:t>
+      </w:r>
+      <w:proofErr w:type="spellEnd"/>
       <w:r>
         <w:rPr>
           <w:rFonts w:ascii="Arial" w:hAnsi="Arial" w:cs="Arial"/>
@@ -1903,9 +1919,259 @@
           <w:color w:val="000000"/>
           <w:sz w:val="18"/>
           <w:szCs w:val="20"/>
-        </w:rPr>
-        <w:t xml:space="preserve"> setpoint</w:t>
-      </w:r>
+          <w:lang w:val="es-AR"/>
+        </w:rPr>
+        <w:t xml:space="preserve"> </w:t>
+      </w:r>
+      <w:proofErr w:type="spellStart"/>
+      <w:r>
+        <w:rPr>
+          <w:rFonts w:ascii="Arial" w:hAnsi="Arial" w:cs="Arial"/>
+          <w:i/>
+          <w:color w:val="000000"/>
+          <w:sz w:val="18"/>
+          <w:szCs w:val="20"/>
+          <w:lang w:val="es-AR"/>
+        </w:rPr>
+        <w:t>Space</w:t>
+      </w:r>
+      <w:proofErr w:type="spellEnd"/>
+      <w:r>
+        <w:rPr>
+          <w:rFonts w:ascii="Arial" w:hAnsi="Arial" w:cs="Arial"/>
+          <w:i/>
+          <w:color w:val="000000"/>
+          <w:sz w:val="18"/>
+          <w:szCs w:val="20"/>
+          <w:lang w:val="es-AR"/>
+        </w:rPr>
+        <w:t xml:space="preserve">), tanto en una aplicación de comandos CLI como en una aplicación </w:t>
+      </w:r>
+      <w:r>
+        <w:rPr>
+          <w:rFonts w:ascii="Arial" w:hAnsi="Arial" w:cs="Arial"/>
+          <w:i/>
+          <w:color w:val="000000"/>
+          <w:sz w:val="18"/>
+          <w:szCs w:val="20"/>
+          <w:lang w:val="es-AR"/>
+        </w:rPr>
+        <w:t xml:space="preserve">web GUI. </w:t>
+      </w:r>
+      <w:r>
+        <w:rPr>
+          <w:rFonts w:ascii="Arial" w:hAnsi="Arial" w:cs="Arial"/>
+          <w:i/>
+          <w:color w:val="000000"/>
+          <w:sz w:val="18"/>
+          <w:szCs w:val="20"/>
+        </w:rPr>
+        <w:t xml:space="preserve">El </w:t>
+      </w:r>
+      <w:proofErr w:type="gramStart"/>
+      <w:r>
+        <w:rPr>
+          <w:rFonts w:ascii="Arial" w:hAnsi="Arial" w:cs="Arial"/>
+          <w:i/>
+          <w:color w:val="000000"/>
+          <w:sz w:val="18"/>
+          <w:szCs w:val="20"/>
+        </w:rPr>
+        <w:t>driver</w:t>
+      </w:r>
+      <w:proofErr w:type="gramEnd"/>
+      <w:r>
+        <w:rPr>
+          <w:rFonts w:ascii="Arial" w:hAnsi="Arial" w:cs="Arial"/>
+          <w:i/>
+          <w:color w:val="000000"/>
+          <w:sz w:val="18"/>
+          <w:szCs w:val="20"/>
+        </w:rPr>
+        <w:t xml:space="preserve"> fue programado </w:t>
+      </w:r>
+      <w:r>
+        <w:rPr>
+          <w:rFonts w:ascii="Arial" w:hAnsi="Arial" w:cs="Arial"/>
+          <w:i/>
+          <w:color w:val="000000"/>
+          <w:sz w:val="18"/>
+          <w:szCs w:val="20"/>
+        </w:rPr>
+        <w:t>sobre el IDE Visual Studio</w:t>
+      </w:r>
+      <w:r>
+        <w:rPr>
+          <w:rFonts w:ascii="Arial" w:hAnsi="Arial" w:cs="Arial"/>
+          <w:i/>
+          <w:color w:val="000000"/>
+          <w:sz w:val="18"/>
+          <w:szCs w:val="20"/>
+        </w:rPr>
+        <w:t xml:space="preserve"> </w:t>
+      </w:r>
+      <w:proofErr w:type="spellStart"/>
+      <w:r>
+        <w:rPr>
+          <w:rFonts w:ascii="Arial" w:hAnsi="Arial" w:cs="Arial"/>
+          <w:i/>
+          <w:color w:val="000000"/>
+          <w:sz w:val="18"/>
+          <w:szCs w:val="20"/>
+        </w:rPr>
+        <w:t>Code</w:t>
+      </w:r>
+      <w:proofErr w:type="spellEnd"/>
+      <w:r>
+        <w:rPr>
+          <w:rFonts w:ascii="Arial" w:hAnsi="Arial" w:cs="Arial"/>
+          <w:i/>
+          <w:color w:val="000000"/>
+          <w:sz w:val="18"/>
+          <w:szCs w:val="20"/>
+        </w:rPr>
+        <w:t xml:space="preserve"> en lenguaje C, y la aplicación de </w:t>
+      </w:r>
+      <w:proofErr w:type="spellStart"/>
+      <w:r>
+        <w:rPr>
+          <w:rFonts w:ascii="Arial" w:hAnsi="Arial" w:cs="Arial"/>
+          <w:i/>
+          <w:color w:val="000000"/>
+          <w:sz w:val="18"/>
+          <w:szCs w:val="20"/>
+        </w:rPr>
+        <w:t>User</w:t>
+      </w:r>
+      <w:proofErr w:type="spellEnd"/>
+      <w:r>
+        <w:rPr>
+          <w:rFonts w:ascii="Arial" w:hAnsi="Arial" w:cs="Arial"/>
+          <w:i/>
+          <w:color w:val="000000"/>
+          <w:sz w:val="18"/>
+          <w:szCs w:val="20"/>
+        </w:rPr>
+        <w:t xml:space="preserve"> </w:t>
+      </w:r>
+      <w:proofErr w:type="spellStart"/>
+      <w:r>
+        <w:rPr>
+          <w:rFonts w:ascii="Arial" w:hAnsi="Arial" w:cs="Arial"/>
+          <w:i/>
+          <w:color w:val="000000"/>
+          <w:sz w:val="18"/>
+          <w:szCs w:val="20"/>
+        </w:rPr>
+        <w:t>Space</w:t>
+      </w:r>
+      <w:proofErr w:type="spellEnd"/>
+      <w:r>
+        <w:rPr>
+          <w:rFonts w:ascii="Arial" w:hAnsi="Arial" w:cs="Arial"/>
+          <w:i/>
+          <w:color w:val="000000"/>
+          <w:sz w:val="18"/>
+          <w:szCs w:val="20"/>
+        </w:rPr>
+        <w:t xml:space="preserve"> </w:t>
+      </w:r>
+      <w:r>
+        <w:rPr>
+          <w:rFonts w:ascii="Arial" w:hAnsi="Arial" w:cs="Arial"/>
+          <w:i/>
+          <w:color w:val="000000"/>
+          <w:sz w:val="18"/>
+          <w:szCs w:val="20"/>
+        </w:rPr>
+        <w:t xml:space="preserve">programada en Python, HTML, CSS y </w:t>
+      </w:r>
+      <w:proofErr w:type="spellStart"/>
+      <w:r>
+        <w:rPr>
+          <w:rFonts w:ascii="Arial" w:hAnsi="Arial" w:cs="Arial"/>
+          <w:i/>
+          <w:color w:val="000000"/>
+          <w:sz w:val="18"/>
+          <w:szCs w:val="20"/>
+        </w:rPr>
+        <w:t>Javascript</w:t>
+      </w:r>
+      <w:proofErr w:type="spellEnd"/>
+      <w:r>
+        <w:rPr>
+          <w:rFonts w:ascii="Arial" w:hAnsi="Arial" w:cs="Arial"/>
+          <w:i/>
+          <w:color w:val="000000"/>
+          <w:sz w:val="18"/>
+          <w:szCs w:val="20"/>
+        </w:rPr>
+        <w:t xml:space="preserve">. </w:t>
+      </w:r>
+      <w:r>
+        <w:rPr>
+          <w:rFonts w:ascii="Arial" w:hAnsi="Arial" w:cs="Arial"/>
+          <w:i/>
+          <w:color w:val="000000"/>
+          <w:sz w:val="18"/>
+          <w:szCs w:val="20"/>
+          <w:lang w:val="es-AR"/>
+        </w:rPr>
+        <w:t xml:space="preserve">El sistema </w:t>
+      </w:r>
+      <w:r>
+        <w:rPr>
+          <w:rFonts w:ascii="Arial" w:hAnsi="Arial" w:cs="Arial"/>
+          <w:i/>
+          <w:color w:val="000000"/>
+          <w:sz w:val="18"/>
+          <w:szCs w:val="20"/>
+          <w:lang w:val="es-AR"/>
+        </w:rPr>
+        <w:t xml:space="preserve">permitirá </w:t>
+      </w:r>
+      <w:r>
+        <w:rPr>
+          <w:rFonts w:ascii="Arial" w:hAnsi="Arial" w:cs="Arial"/>
+          <w:i/>
+          <w:color w:val="000000"/>
+          <w:sz w:val="18"/>
+          <w:szCs w:val="20"/>
+        </w:rPr>
+        <w:t xml:space="preserve">la lectura y modificación de parámetros </w:t>
+      </w:r>
+      <w:r>
+        <w:rPr>
+          <w:rFonts w:ascii="Arial" w:hAnsi="Arial" w:cs="Arial"/>
+          <w:i/>
+          <w:color w:val="000000"/>
+          <w:sz w:val="18"/>
+          <w:szCs w:val="20"/>
+        </w:rPr>
+        <w:t>del</w:t>
+      </w:r>
+      <w:r>
+        <w:rPr>
+          <w:rFonts w:ascii="Arial" w:hAnsi="Arial" w:cs="Arial"/>
+          <w:i/>
+          <w:color w:val="000000"/>
+          <w:sz w:val="18"/>
+          <w:szCs w:val="20"/>
+        </w:rPr>
+        <w:t xml:space="preserve"> </w:t>
+      </w:r>
+      <w:proofErr w:type="spellStart"/>
+      <w:r>
+        <w:rPr>
+          <w:rFonts w:ascii="Arial" w:hAnsi="Arial" w:cs="Arial"/>
+          <w:i/>
+          <w:color w:val="000000"/>
+          <w:sz w:val="18"/>
+          <w:szCs w:val="20"/>
+        </w:rPr>
+        <w:t>setpoint</w:t>
+      </w:r>
+      <w:proofErr w:type="spellEnd"/>
       <w:r>
         <w:rPr>
           <w:rFonts w:ascii="Arial" w:hAnsi="Arial" w:cs="Arial"/>
@@ -2031,16 +2297,80 @@
           <w:sz w:val="18"/>
           <w:szCs w:val="20"/>
         </w:rPr>
-        <w:t>, Kernel, Driver</w:t>
-      </w:r>
-      <w:r>
-        <w:rPr>
-          <w:rFonts w:ascii="Arial" w:hAnsi="Arial" w:cs="Arial"/>
-          <w:sz w:val="18"/>
-          <w:szCs w:val="20"/>
-        </w:rPr>
-        <w:t>, Char Device, Serdev</w:t>
-      </w:r>
+        <w:t xml:space="preserve">, </w:t>
+      </w:r>
+      <w:proofErr w:type="spellStart"/>
+      <w:r>
+        <w:rPr>
+          <w:rFonts w:ascii="Arial" w:hAnsi="Arial" w:cs="Arial"/>
+          <w:sz w:val="18"/>
+          <w:szCs w:val="20"/>
+        </w:rPr>
+        <w:t>Kernel</w:t>
+      </w:r>
+      <w:proofErr w:type="spellEnd"/>
+      <w:r>
+        <w:rPr>
+          <w:rFonts w:ascii="Arial" w:hAnsi="Arial" w:cs="Arial"/>
+          <w:sz w:val="18"/>
+          <w:szCs w:val="20"/>
+        </w:rPr>
+        <w:t>, Driver</w:t>
+      </w:r>
+      <w:r>
+        <w:rPr>
+          <w:rFonts w:ascii="Arial" w:hAnsi="Arial" w:cs="Arial"/>
+          <w:sz w:val="18"/>
+          <w:szCs w:val="20"/>
+        </w:rPr>
+        <w:t xml:space="preserve">, </w:t>
+      </w:r>
+      <w:proofErr w:type="spellStart"/>
+      <w:r>
+        <w:rPr>
+          <w:rFonts w:ascii="Arial" w:hAnsi="Arial" w:cs="Arial"/>
+          <w:sz w:val="18"/>
+          <w:szCs w:val="20"/>
+        </w:rPr>
+        <w:t>Char</w:t>
+      </w:r>
+      <w:proofErr w:type="spellEnd"/>
+      <w:r>
+        <w:rPr>
+          <w:rFonts w:ascii="Arial" w:hAnsi="Arial" w:cs="Arial"/>
+          <w:sz w:val="18"/>
+          <w:szCs w:val="20"/>
+        </w:rPr>
+        <w:t xml:space="preserve"> </w:t>
+      </w:r>
+      <w:proofErr w:type="spellStart"/>
+      <w:r>
+        <w:rPr>
+          <w:rFonts w:ascii="Arial" w:hAnsi="Arial" w:cs="Arial"/>
+          <w:sz w:val="18"/>
+          <w:szCs w:val="20"/>
+        </w:rPr>
+        <w:t>Device</w:t>
+      </w:r>
+      <w:proofErr w:type="spellEnd"/>
+      <w:r>
+        <w:rPr>
+          <w:rFonts w:ascii="Arial" w:hAnsi="Arial" w:cs="Arial"/>
+          <w:sz w:val="18"/>
+          <w:szCs w:val="20"/>
+        </w:rPr>
+        <w:t xml:space="preserve">, </w:t>
+      </w:r>
+      <w:proofErr w:type="spellStart"/>
+      <w:r>
+        <w:rPr>
+          <w:rFonts w:ascii="Arial" w:hAnsi="Arial" w:cs="Arial"/>
+          <w:sz w:val="18"/>
+          <w:szCs w:val="20"/>
+        </w:rPr>
+        <w:t>Serdev</w:t>
+      </w:r>
+      <w:proofErr w:type="spellEnd"/>
     </w:p>
     <w:p>
       <w:pPr>
@@ -2126,6 +2456,7 @@
         </w:rPr>
         <w:t xml:space="preserve">En este contexto, la etapa EGB se centra en el desarrollo de un </w:t>
       </w:r>
+      <w:proofErr w:type="gramStart"/>
       <w:r>
         <w:rPr>
           <w:rFonts w:ascii="Arial" w:hAnsi="Arial" w:cs="Arial"/>
@@ -2135,16 +2466,61 @@
           <w:szCs w:val="20"/>
           <w:lang w:val="es-AR"/>
         </w:rPr>
-        <w:t>driver de kernel</w:t>
-      </w:r>
-      <w:r>
-        <w:rPr>
-          <w:rFonts w:ascii="Arial" w:hAnsi="Arial" w:cs="Arial"/>
-          <w:sz w:val="18"/>
-          <w:szCs w:val="20"/>
-          <w:lang w:val="es-AR"/>
-        </w:rPr>
-        <w:t xml:space="preserve"> que permita una comunicación confiable entre un sistema basado en Linux y una plataforma embebida que opera bajo un RTOS. A diferencia de soluciones de alto nivel, la implementación a nivel de kernel permite un mayor control de los recursos, mejor gestión de concurrencia y manejo directo del hardware.</w:t>
+        <w:t>driver</w:t>
+      </w:r>
+      <w:proofErr w:type="gramEnd"/>
+      <w:r>
+        <w:rPr>
+          <w:rFonts w:ascii="Arial" w:hAnsi="Arial" w:cs="Arial"/>
+          <w:b/>
+          <w:bCs/>
+          <w:sz w:val="18"/>
+          <w:szCs w:val="20"/>
+          <w:lang w:val="es-AR"/>
+        </w:rPr>
+        <w:t xml:space="preserve"> de </w:t>
+      </w:r>
+      <w:proofErr w:type="spellStart"/>
+      <w:r>
+        <w:rPr>
+          <w:rFonts w:ascii="Arial" w:hAnsi="Arial" w:cs="Arial"/>
+          <w:b/>
+          <w:bCs/>
+          <w:sz w:val="18"/>
+          <w:szCs w:val="20"/>
+          <w:lang w:val="es-AR"/>
+        </w:rPr>
+        <w:t>kernel</w:t>
+      </w:r>
+      <w:proofErr w:type="spellEnd"/>
+      <w:r>
+        <w:rPr>
+          <w:rFonts w:ascii="Arial" w:hAnsi="Arial" w:cs="Arial"/>
+          <w:sz w:val="18"/>
+          <w:szCs w:val="20"/>
+          <w:lang w:val="es-AR"/>
+        </w:rPr>
+        <w:t xml:space="preserve"> que permita una comunicación confiable entre un sistema basado en Linux y una plataforma embebida que opera bajo un RTOS. A diferencia de soluciones de alto nivel, la implementación a nivel de </w:t>
+      </w:r>
+      <w:proofErr w:type="spellStart"/>
+      <w:r>
+        <w:rPr>
+          <w:rFonts w:ascii="Arial" w:hAnsi="Arial" w:cs="Arial"/>
+          <w:sz w:val="18"/>
+          <w:szCs w:val="20"/>
+          <w:lang w:val="es-AR"/>
+        </w:rPr>
+        <w:t>kernel</w:t>
+      </w:r>
+      <w:proofErr w:type="spellEnd"/>
+      <w:r>
+        <w:rPr>
+          <w:rFonts w:ascii="Arial" w:hAnsi="Arial" w:cs="Arial"/>
+          <w:sz w:val="18"/>
+          <w:szCs w:val="20"/>
+          <w:lang w:val="es-AR"/>
+        </w:rPr>
+        <w:t xml:space="preserve"> permite un mayor control de los recursos, mejor gestión de concurrencia y manejo directo del hardware.</w:t>
       </w:r>
     </w:p>
     <w:p>
@@ -2165,7 +2541,27 @@
           <w:szCs w:val="20"/>
           <w:lang w:val="es-AR"/>
         </w:rPr>
-        <w:t>El driver desarrollado integra dos mecanismos principales:</w:t>
+        <w:t xml:space="preserve">El </w:t>
+      </w:r>
+      <w:proofErr w:type="gramStart"/>
+      <w:r>
+        <w:rPr>
+          <w:rFonts w:ascii="Arial" w:hAnsi="Arial" w:cs="Arial"/>
+          <w:sz w:val="18"/>
+          <w:szCs w:val="20"/>
+          <w:lang w:val="es-AR"/>
+        </w:rPr>
+        <w:t>driver</w:t>
+      </w:r>
+      <w:proofErr w:type="gramEnd"/>
+      <w:r>
+        <w:rPr>
+          <w:rFonts w:ascii="Arial" w:hAnsi="Arial" w:cs="Arial"/>
+          <w:sz w:val="18"/>
+          <w:szCs w:val="20"/>
+          <w:lang w:val="es-AR"/>
+        </w:rPr>
+        <w:t xml:space="preserve"> desarrollado integra dos mecanismos principales:</w:t>
       </w:r>
     </w:p>
     <w:p>
@@ -2225,7 +2621,35 @@
           <w:szCs w:val="20"/>
           <w:lang w:val="es-AR"/>
         </w:rPr>
-        <w:t>(char dev)</w:t>
+        <w:t xml:space="preserve">(char </w:t>
+      </w:r>
+      <w:proofErr w:type="spellStart"/>
+      <w:r>
+        <w:rPr>
+          <w:rFonts w:ascii="Arial" w:hAnsi="Arial" w:cs="Arial"/>
+          <w:b/>
+          <w:bCs/>
+          <w:i/>
+          <w:iCs/>
+          <w:sz w:val="18"/>
+          <w:szCs w:val="20"/>
+          <w:lang w:val="es-AR"/>
+        </w:rPr>
+        <w:t>dev</w:t>
+      </w:r>
+      <w:proofErr w:type="spellEnd"/>
+      <w:r>
+        <w:rPr>
+          <w:rFonts w:ascii="Arial" w:hAnsi="Arial" w:cs="Arial"/>
+          <w:b/>
+          <w:bCs/>
+          <w:i/>
+          <w:iCs/>
+          <w:sz w:val="18"/>
+          <w:szCs w:val="20"/>
+          <w:lang w:val="es-AR"/>
+        </w:rPr>
+        <w:t>)</w:t>
       </w:r>
       <w:r>
         <w:rPr>
@@ -2245,8 +2669,45 @@
           <w:szCs w:val="20"/>
           <w:lang w:val="es-AR"/>
         </w:rPr>
-        <w:t>/dev/egb</w:t>
-      </w:r>
+        <w:t>/</w:t>
+      </w:r>
+      <w:proofErr w:type="spellStart"/>
+      <w:r>
+        <w:rPr>
+          <w:rFonts w:ascii="Arial" w:hAnsi="Arial" w:cs="Arial"/>
+          <w:b/>
+          <w:bCs/>
+          <w:sz w:val="18"/>
+          <w:szCs w:val="20"/>
+          <w:lang w:val="es-AR"/>
+        </w:rPr>
+        <w:t>dev</w:t>
+      </w:r>
+      <w:proofErr w:type="spellEnd"/>
+      <w:r>
+        <w:rPr>
+          <w:rFonts w:ascii="Arial" w:hAnsi="Arial" w:cs="Arial"/>
+          <w:b/>
+          <w:bCs/>
+          <w:sz w:val="18"/>
+          <w:szCs w:val="20"/>
+          <w:lang w:val="es-AR"/>
+        </w:rPr>
+        <w:t>/</w:t>
+      </w:r>
+      <w:proofErr w:type="spellStart"/>
+      <w:r>
+        <w:rPr>
+          <w:rFonts w:ascii="Arial" w:hAnsi="Arial" w:cs="Arial"/>
+          <w:b/>
+          <w:bCs/>
+          <w:sz w:val="18"/>
+          <w:szCs w:val="20"/>
+          <w:lang w:val="es-AR"/>
+        </w:rPr>
+        <w:t>egb</w:t>
+      </w:r>
+      <w:proofErr w:type="spellEnd"/>
       <w:r>
         <w:rPr>
           <w:rFonts w:ascii="Arial" w:hAnsi="Arial" w:cs="Arial"/>
@@ -2281,6 +2742,7 @@
         </w:rPr>
         <w:t xml:space="preserve">Una capa de comunicación serie mediante </w:t>
       </w:r>
+      <w:proofErr w:type="spellStart"/>
       <w:r>
         <w:rPr>
           <w:rFonts w:ascii="Arial" w:hAnsi="Arial" w:cs="Arial"/>
@@ -2292,14 +2754,35 @@
         </w:rPr>
         <w:t>serdev</w:t>
       </w:r>
-      <w:r>
-        <w:rPr>
-          <w:rFonts w:ascii="Arial" w:hAnsi="Arial" w:cs="Arial"/>
-          <w:sz w:val="18"/>
-          <w:szCs w:val="20"/>
-          <w:lang w:val="es-AR"/>
-        </w:rPr>
-        <w:t>, que gestiona la UART a nivel kernel y permite una comunicación eficiente y de baja latencia.</w:t>
+      <w:proofErr w:type="spellEnd"/>
+      <w:r>
+        <w:rPr>
+          <w:rFonts w:ascii="Arial" w:hAnsi="Arial" w:cs="Arial"/>
+          <w:sz w:val="18"/>
+          <w:szCs w:val="20"/>
+          <w:lang w:val="es-AR"/>
+        </w:rPr>
+        <w:t xml:space="preserve">, que gestiona la UART a nivel </w:t>
+      </w:r>
+      <w:proofErr w:type="spellStart"/>
+      <w:r>
+        <w:rPr>
+          <w:rFonts w:ascii="Arial" w:hAnsi="Arial" w:cs="Arial"/>
+          <w:sz w:val="18"/>
+          <w:szCs w:val="20"/>
+          <w:lang w:val="es-AR"/>
+        </w:rPr>
+        <w:t>kernel</w:t>
+      </w:r>
+      <w:proofErr w:type="spellEnd"/>
+      <w:r>
+        <w:rPr>
+          <w:rFonts w:ascii="Arial" w:hAnsi="Arial" w:cs="Arial"/>
+          <w:sz w:val="18"/>
+          <w:szCs w:val="20"/>
+          <w:lang w:val="es-AR"/>
+        </w:rPr>
+        <w:t xml:space="preserve"> y permite una comunicación eficiente y de baja latencia.</w:t>
       </w:r>
     </w:p>
     <w:p>
@@ -2379,8 +2862,21 @@
           <w:szCs w:val="20"/>
           <w:lang w:val="es-AR"/>
         </w:rPr>
-        <w:t>módulo de kernel</w:t>
-      </w:r>
+        <w:t xml:space="preserve">módulo de </w:t>
+      </w:r>
+      <w:proofErr w:type="spellStart"/>
+      <w:r>
+        <w:rPr>
+          <w:rFonts w:ascii="Arial" w:hAnsi="Arial" w:cs="Arial"/>
+          <w:b/>
+          <w:bCs/>
+          <w:sz w:val="18"/>
+          <w:szCs w:val="20"/>
+          <w:lang w:val="es-AR"/>
+        </w:rPr>
+        <w:t>kernel</w:t>
+      </w:r>
+      <w:proofErr w:type="spellEnd"/>
       <w:r>
         <w:rPr>
           <w:rFonts w:ascii="Arial" w:hAnsi="Arial" w:cs="Arial"/>
@@ -2425,8 +2921,21 @@
           <w:szCs w:val="20"/>
           <w:lang w:val="es-AR"/>
         </w:rPr>
-        <w:t>comunicación UART a nivel kernel</w:t>
-      </w:r>
+        <w:t xml:space="preserve">comunicación UART a nivel </w:t>
+      </w:r>
+      <w:proofErr w:type="spellStart"/>
+      <w:r>
+        <w:rPr>
+          <w:rFonts w:ascii="Arial" w:hAnsi="Arial" w:cs="Arial"/>
+          <w:b/>
+          <w:bCs/>
+          <w:sz w:val="18"/>
+          <w:szCs w:val="20"/>
+          <w:lang w:val="es-AR"/>
+        </w:rPr>
+        <w:t>kernel</w:t>
+      </w:r>
+      <w:proofErr w:type="spellEnd"/>
       <w:r>
         <w:rPr>
           <w:rFonts w:ascii="Arial" w:hAnsi="Arial" w:cs="Arial"/>
@@ -2454,6 +2963,7 @@
         </w:rPr>
         <w:t xml:space="preserve">ante la infraestructura </w:t>
       </w:r>
+      <w:proofErr w:type="spellStart"/>
       <w:r>
         <w:rPr>
           <w:rFonts w:ascii="Arial" w:hAnsi="Arial" w:cs="Arial"/>
@@ -2465,6 +2975,7 @@
         </w:rPr>
         <w:t>serdev</w:t>
       </w:r>
+      <w:proofErr w:type="spellEnd"/>
       <w:r>
         <w:rPr>
           <w:rFonts w:ascii="Arial" w:hAnsi="Arial" w:cs="Arial"/>
@@ -2518,7 +3029,27 @@
           <w:szCs w:val="20"/>
           <w:lang w:val="es-AR"/>
         </w:rPr>
-        <w:t xml:space="preserve"> que permita setear y tomar parámetros de la EGA.</w:t>
+        <w:t xml:space="preserve"> que permita </w:t>
+      </w:r>
+      <w:proofErr w:type="spellStart"/>
+      <w:r>
+        <w:rPr>
+          <w:rFonts w:ascii="Arial" w:hAnsi="Arial" w:cs="Arial"/>
+          <w:sz w:val="18"/>
+          <w:szCs w:val="20"/>
+          <w:lang w:val="es-AR"/>
+        </w:rPr>
+        <w:t>setear</w:t>
+      </w:r>
+      <w:proofErr w:type="spellEnd"/>
+      <w:r>
+        <w:rPr>
+          <w:rFonts w:ascii="Arial" w:hAnsi="Arial" w:cs="Arial"/>
+          <w:sz w:val="18"/>
+          <w:szCs w:val="20"/>
+          <w:lang w:val="es-AR"/>
+        </w:rPr>
+        <w:t xml:space="preserve"> y tomar parámetros de la EGA.</w:t>
       </w:r>
     </w:p>
     <w:p>
@@ -2679,7 +3210,27 @@
           <w:sz w:val="18"/>
           <w:szCs w:val="20"/>
         </w:rPr>
-        <w:t>de setpoint, logs y variables PID.</w:t>
+        <w:t xml:space="preserve">de </w:t>
+      </w:r>
+      <w:proofErr w:type="spellStart"/>
+      <w:r>
+        <w:rPr>
+          <w:rFonts w:ascii="Arial" w:hAnsi="Arial" w:cs="Arial"/>
+          <w:b/>
+          <w:sz w:val="18"/>
+          <w:szCs w:val="20"/>
+        </w:rPr>
+        <w:t>setpoint</w:t>
+      </w:r>
+      <w:proofErr w:type="spellEnd"/>
+      <w:r>
+        <w:rPr>
+          <w:rFonts w:ascii="Arial" w:hAnsi="Arial" w:cs="Arial"/>
+          <w:b/>
+          <w:sz w:val="18"/>
+          <w:szCs w:val="20"/>
+        </w:rPr>
+        <w:t>, logs y variables PID.</w:t>
       </w:r>
     </w:p>
     <w:p>
@@ -2732,7 +3283,27 @@
           <w:sz w:val="18"/>
           <w:szCs w:val="20"/>
         </w:rPr>
-        <w:t>de setpoint y variables PID.</w:t>
+        <w:t xml:space="preserve">de </w:t>
+      </w:r>
+      <w:proofErr w:type="spellStart"/>
+      <w:r>
+        <w:rPr>
+          <w:rFonts w:ascii="Arial" w:hAnsi="Arial" w:cs="Arial"/>
+          <w:b/>
+          <w:sz w:val="18"/>
+          <w:szCs w:val="20"/>
+        </w:rPr>
+        <w:t>setpoint</w:t>
+      </w:r>
+      <w:proofErr w:type="spellEnd"/>
+      <w:r>
+        <w:rPr>
+          <w:rFonts w:ascii="Arial" w:hAnsi="Arial" w:cs="Arial"/>
+          <w:b/>
+          <w:sz w:val="18"/>
+          <w:szCs w:val="20"/>
+        </w:rPr>
+        <w:t xml:space="preserve"> y variables PID.</w:t>
       </w:r>
     </w:p>
     <w:p>
@@ -2952,7 +3523,43 @@
           <w:sz w:val="18"/>
           <w:szCs w:val="20"/>
         </w:rPr>
-        <w:t>Para poder comunicar la EGA con el kernel mediante UART tuvieron que realizarse modificaciones en el desarrollo del código en FreeRTOS.</w:t>
+        <w:t xml:space="preserve">Para poder comunicar la EGA con el </w:t>
+      </w:r>
+      <w:proofErr w:type="spellStart"/>
+      <w:r>
+        <w:rPr>
+          <w:rFonts w:ascii="Arial" w:hAnsi="Arial" w:cs="Arial"/>
+          <w:sz w:val="18"/>
+          <w:szCs w:val="20"/>
+        </w:rPr>
+        <w:t>kernel</w:t>
+      </w:r>
+      <w:proofErr w:type="spellEnd"/>
+      <w:r>
+        <w:rPr>
+          <w:rFonts w:ascii="Arial" w:hAnsi="Arial" w:cs="Arial"/>
+          <w:sz w:val="18"/>
+          <w:szCs w:val="20"/>
+        </w:rPr>
+        <w:t xml:space="preserve"> mediante UART tuvieron que realizarse modificaciones en el desarrollo del código en </w:t>
+      </w:r>
+      <w:proofErr w:type="spellStart"/>
+      <w:r>
+        <w:rPr>
+          <w:rFonts w:ascii="Arial" w:hAnsi="Arial" w:cs="Arial"/>
+          <w:sz w:val="18"/>
+          <w:szCs w:val="20"/>
+        </w:rPr>
+        <w:t>FreeRTOS</w:t>
+      </w:r>
+      <w:proofErr w:type="spellEnd"/>
+      <w:r>
+        <w:rPr>
+          <w:rFonts w:ascii="Arial" w:hAnsi="Arial" w:cs="Arial"/>
+          <w:sz w:val="18"/>
+          <w:szCs w:val="20"/>
+        </w:rPr>
+        <w:t>.</w:t>
       </w:r>
     </w:p>
     <w:p>
@@ -3638,6 +4245,7 @@
         </w:rPr>
         <w:t xml:space="preserve"> </w:t>
       </w:r>
+      <w:proofErr w:type="spellStart"/>
       <w:r>
         <w:rPr>
           <w:rFonts w:ascii="Arial" w:hAnsi="Arial" w:cs="Arial"/>
@@ -3648,6 +4256,7 @@
         </w:rPr>
         <w:t>Setpoint</w:t>
       </w:r>
+      <w:proofErr w:type="spellEnd"/>
     </w:p>
     <w:p>
       <w:pPr>
@@ -3702,6 +4311,7 @@
         </w:rPr>
         <w:t xml:space="preserve"> </w:t>
       </w:r>
+      <w:proofErr w:type="spellStart"/>
       <w:r>
         <w:rPr>
           <w:rFonts w:ascii="Arial" w:hAnsi="Arial" w:cs="Arial"/>
@@ -3710,7 +4320,18 @@
           <w:sz w:val="18"/>
           <w:szCs w:val="18"/>
         </w:rPr>
-        <w:t>Log completo de la lectura</w:t>
+        <w:t>Log</w:t>
+      </w:r>
+      <w:proofErr w:type="spellEnd"/>
+      <w:r>
+        <w:rPr>
+          <w:rFonts w:ascii="Arial" w:hAnsi="Arial" w:cs="Arial"/>
+          <w:i/>
+          <w:iCs/>
+          <w:sz w:val="18"/>
+          <w:szCs w:val="18"/>
+        </w:rPr>
+        <w:t xml:space="preserve"> completo de la lectura</w:t>
       </w:r>
     </w:p>
     <w:p>
@@ -3929,7 +4550,47 @@
           <w:szCs w:val="18"/>
           <w:lang w:val="es-AR"/>
         </w:rPr>
-        <w:t>El desarrollo de la EGB permitió consolidar y expandir las capacidades del sistema implementado en la EGA, logrando una integración completa entre un sistema embebido basado en RTOS y un sistema operativo de propósito general (GPOS) mediante la implementación de un driver de kernel en Linux.</w:t>
+        <w:t xml:space="preserve">El desarrollo de la EGB permitió consolidar y expandir las capacidades del sistema implementado en la EGA, logrando una integración completa entre un sistema embebido basado en RTOS y un sistema operativo de propósito general (GPOS) mediante la implementación de un </w:t>
+      </w:r>
+      <w:proofErr w:type="gramStart"/>
+      <w:r>
+        <w:rPr>
+          <w:rFonts w:ascii="Arial" w:hAnsi="Arial" w:cs="Arial"/>
+          <w:sz w:val="18"/>
+          <w:szCs w:val="18"/>
+          <w:lang w:val="es-AR"/>
+        </w:rPr>
+        <w:t>driver</w:t>
+      </w:r>
+      <w:proofErr w:type="gramEnd"/>
+      <w:r>
+        <w:rPr>
+          <w:rFonts w:ascii="Arial" w:hAnsi="Arial" w:cs="Arial"/>
+          <w:sz w:val="18"/>
+          <w:szCs w:val="18"/>
+          <w:lang w:val="es-AR"/>
+        </w:rPr>
+        <w:t xml:space="preserve"> de </w:t>
+      </w:r>
+      <w:proofErr w:type="spellStart"/>
+      <w:r>
+        <w:rPr>
+          <w:rFonts w:ascii="Arial" w:hAnsi="Arial" w:cs="Arial"/>
+          <w:sz w:val="18"/>
+          <w:szCs w:val="18"/>
+          <w:lang w:val="es-AR"/>
+        </w:rPr>
+        <w:t>kernel</w:t>
+      </w:r>
+      <w:proofErr w:type="spellEnd"/>
+      <w:r>
+        <w:rPr>
+          <w:rFonts w:ascii="Arial" w:hAnsi="Arial" w:cs="Arial"/>
+          <w:sz w:val="18"/>
+          <w:szCs w:val="18"/>
+          <w:lang w:val="es-AR"/>
+        </w:rPr>
+        <w:t xml:space="preserve"> en Linux.</w:t>
       </w:r>
     </w:p>
     <w:p>
@@ -3950,7 +4611,27 @@
           <w:szCs w:val="18"/>
           <w:lang w:val="es-AR"/>
         </w:rPr>
-        <w:t xml:space="preserve">La creación del módulo de kernel tipo </w:t>
+        <w:t xml:space="preserve">La creación del módulo de </w:t>
+      </w:r>
+      <w:proofErr w:type="spellStart"/>
+      <w:r>
+        <w:rPr>
+          <w:rFonts w:ascii="Arial" w:hAnsi="Arial" w:cs="Arial"/>
+          <w:sz w:val="18"/>
+          <w:szCs w:val="18"/>
+          <w:lang w:val="es-AR"/>
+        </w:rPr>
+        <w:t>kernel</w:t>
+      </w:r>
+      <w:proofErr w:type="spellEnd"/>
+      <w:r>
+        <w:rPr>
+          <w:rFonts w:ascii="Arial" w:hAnsi="Arial" w:cs="Arial"/>
+          <w:sz w:val="18"/>
+          <w:szCs w:val="18"/>
+          <w:lang w:val="es-AR"/>
+        </w:rPr>
+        <w:t xml:space="preserve"> tipo </w:t>
       </w:r>
       <w:r>
         <w:rPr>
@@ -3972,6 +4653,7 @@
         </w:rPr>
         <w:t xml:space="preserve"> junto con el uso de la infraestructura </w:t>
       </w:r>
+      <w:proofErr w:type="spellStart"/>
       <w:r>
         <w:rPr>
           <w:rFonts w:ascii="Arial" w:hAnsi="Arial" w:cs="Arial"/>
@@ -3983,6 +4665,7 @@
         </w:rPr>
         <w:t>serdev</w:t>
       </w:r>
+      <w:proofErr w:type="spellEnd"/>
       <w:r>
         <w:rPr>
           <w:rFonts w:ascii="Arial" w:hAnsi="Arial" w:cs="Arial"/>
@@ -4026,7 +4709,27 @@
           <w:szCs w:val="18"/>
           <w:lang w:val="es-AR"/>
         </w:rPr>
-        <w:t>. Este enfoque a nivel de kernel demostró ser eficiente y controlado</w:t>
+        <w:t xml:space="preserve">. Este enfoque a nivel de </w:t>
+      </w:r>
+      <w:proofErr w:type="spellStart"/>
+      <w:r>
+        <w:rPr>
+          <w:rFonts w:ascii="Arial" w:hAnsi="Arial" w:cs="Arial"/>
+          <w:sz w:val="18"/>
+          <w:szCs w:val="18"/>
+          <w:lang w:val="es-AR"/>
+        </w:rPr>
+        <w:t>kernel</w:t>
+      </w:r>
+      <w:proofErr w:type="spellEnd"/>
+      <w:r>
+        <w:rPr>
+          <w:rFonts w:ascii="Arial" w:hAnsi="Arial" w:cs="Arial"/>
+          <w:sz w:val="18"/>
+          <w:szCs w:val="18"/>
+          <w:lang w:val="es-AR"/>
+        </w:rPr>
+        <w:t xml:space="preserve"> demostró ser eficiente y controlado</w:t>
       </w:r>
       <w:r>
         <w:rPr>
@@ -4083,8 +4786,9 @@
           <w:szCs w:val="18"/>
           <w:lang w:val="es-AR"/>
         </w:rPr>
-        <w:t xml:space="preserve">CLI y una interfaz web GUI permitió validar el funcionamiento del driver desde el </w:t>
-      </w:r>
+        <w:t xml:space="preserve">CLI y una interfaz web GUI permitió validar el funcionamiento del </w:t>
+      </w:r>
+      <w:proofErr w:type="gramStart"/>
       <w:r>
         <w:rPr>
           <w:rFonts w:ascii="Arial" w:hAnsi="Arial" w:cs="Arial"/>
@@ -4092,8 +4796,9 @@
           <w:szCs w:val="18"/>
           <w:lang w:val="es-AR"/>
         </w:rPr>
-        <w:t>User Space</w:t>
-      </w:r>
+        <w:t>driver</w:t>
+      </w:r>
+      <w:proofErr w:type="gramEnd"/>
       <w:r>
         <w:rPr>
           <w:rFonts w:ascii="Arial" w:hAnsi="Arial" w:cs="Arial"/>
@@ -4101,6 +4806,46 @@
           <w:szCs w:val="18"/>
           <w:lang w:val="es-AR"/>
         </w:rPr>
+        <w:t xml:space="preserve"> desde el </w:t>
+      </w:r>
+      <w:proofErr w:type="spellStart"/>
+      <w:r>
+        <w:rPr>
+          <w:rFonts w:ascii="Arial" w:hAnsi="Arial" w:cs="Arial"/>
+          <w:sz w:val="18"/>
+          <w:szCs w:val="18"/>
+          <w:lang w:val="es-AR"/>
+        </w:rPr>
+        <w:t>User</w:t>
+      </w:r>
+      <w:proofErr w:type="spellEnd"/>
+      <w:r>
+        <w:rPr>
+          <w:rFonts w:ascii="Arial" w:hAnsi="Arial" w:cs="Arial"/>
+          <w:sz w:val="18"/>
+          <w:szCs w:val="18"/>
+          <w:lang w:val="es-AR"/>
+        </w:rPr>
+        <w:t xml:space="preserve"> </w:t>
+      </w:r>
+      <w:proofErr w:type="spellStart"/>
+      <w:r>
+        <w:rPr>
+          <w:rFonts w:ascii="Arial" w:hAnsi="Arial" w:cs="Arial"/>
+          <w:sz w:val="18"/>
+          <w:szCs w:val="18"/>
+          <w:lang w:val="es-AR"/>
+        </w:rPr>
+        <w:t>Space</w:t>
+      </w:r>
+      <w:proofErr w:type="spellEnd"/>
+      <w:r>
+        <w:rPr>
+          <w:rFonts w:ascii="Arial" w:hAnsi="Arial" w:cs="Arial"/>
+          <w:sz w:val="18"/>
+          <w:szCs w:val="18"/>
+          <w:lang w:val="es-AR"/>
+        </w:rPr>
         <w:t>, facilitando la interacción con el sistema tanto de forma local como remota</w:t>
       </w:r>
       <w:r>
@@ -4128,7 +4873,27 @@
           <w:szCs w:val="18"/>
           <w:lang w:val="es-AR"/>
         </w:rPr>
-        <w:t>. La posibilidad de enviar comandos, leer variables del sistema y visualizar datos en tiempo real demostró la correcta integración entre las capas de hardware, kernel y aplicaciones de usuario.</w:t>
+        <w:t xml:space="preserve">. La posibilidad de enviar comandos, leer variables del sistema y visualizar datos en tiempo real demostró la correcta integración entre las capas de hardware, </w:t>
+      </w:r>
+      <w:proofErr w:type="spellStart"/>
+      <w:r>
+        <w:rPr>
+          <w:rFonts w:ascii="Arial" w:hAnsi="Arial" w:cs="Arial"/>
+          <w:sz w:val="18"/>
+          <w:szCs w:val="18"/>
+          <w:lang w:val="es-AR"/>
+        </w:rPr>
+        <w:t>kernel</w:t>
+      </w:r>
+      <w:proofErr w:type="spellEnd"/>
+      <w:r>
+        <w:rPr>
+          <w:rFonts w:ascii="Arial" w:hAnsi="Arial" w:cs="Arial"/>
+          <w:sz w:val="18"/>
+          <w:szCs w:val="18"/>
+          <w:lang w:val="es-AR"/>
+        </w:rPr>
+        <w:t xml:space="preserve"> y aplicaciones de usuario.</w:t>
       </w:r>
     </w:p>
     <w:p>
@@ -4149,7 +4914,47 @@
           <w:szCs w:val="18"/>
           <w:lang w:val="es-AR"/>
         </w:rPr>
-        <w:t>En la primer instancia de implementación se detectaron posibles errores en los primeros comandos SET/GET desde la interfaz gráfica y de comandos, pero luego pudieron resolverse haciendo ajustes en el driver del char device, ya que quedaba leyendo un valor anterior.</w:t>
+        <w:t xml:space="preserve">En la </w:t>
+      </w:r>
+      <w:proofErr w:type="gramStart"/>
+      <w:r>
+        <w:rPr>
+          <w:rFonts w:ascii="Arial" w:hAnsi="Arial" w:cs="Arial"/>
+          <w:sz w:val="18"/>
+          <w:szCs w:val="18"/>
+          <w:lang w:val="es-AR"/>
+        </w:rPr>
+        <w:t>primer instancia</w:t>
+      </w:r>
+      <w:proofErr w:type="gramEnd"/>
+      <w:r>
+        <w:rPr>
+          <w:rFonts w:ascii="Arial" w:hAnsi="Arial" w:cs="Arial"/>
+          <w:sz w:val="18"/>
+          <w:szCs w:val="18"/>
+          <w:lang w:val="es-AR"/>
+        </w:rPr>
+        <w:t xml:space="preserve"> de implementación se detectaron posibles errores en los primeros comandos SET/GET desde la interfaz gráfica y de comandos, pero luego pudieron resolverse haciendo ajustes en el </w:t>
+      </w:r>
+      <w:proofErr w:type="gramStart"/>
+      <w:r>
+        <w:rPr>
+          <w:rFonts w:ascii="Arial" w:hAnsi="Arial" w:cs="Arial"/>
+          <w:sz w:val="18"/>
+          <w:szCs w:val="18"/>
+          <w:lang w:val="es-AR"/>
+        </w:rPr>
+        <w:t>driver</w:t>
+      </w:r>
+      <w:proofErr w:type="gramEnd"/>
+      <w:r>
+        <w:rPr>
+          <w:rFonts w:ascii="Arial" w:hAnsi="Arial" w:cs="Arial"/>
+          <w:sz w:val="18"/>
+          <w:szCs w:val="18"/>
+          <w:lang w:val="es-AR"/>
+        </w:rPr>
+        <w:t xml:space="preserve"> del char device, ya que quedaba leyendo un valor anterior.</w:t>
       </w:r>
     </w:p>
     <w:p>
@@ -4299,7 +5104,25 @@
           <w:i/>
           <w:iCs/>
         </w:rPr>
-        <w:t>Desarrollo del kernel de Linux</w:t>
+        <w:t xml:space="preserve">Desarrollo del </w:t>
+      </w:r>
+      <w:proofErr w:type="spellStart"/>
+      <w:r>
+        <w:rPr>
+          <w:rFonts w:ascii="Arial" w:hAnsi="Arial" w:cs="Arial"/>
+          <w:i/>
+          <w:iCs/>
+        </w:rPr>
+        <w:t>kernel</w:t>
+      </w:r>
+      <w:proofErr w:type="spellEnd"/>
+      <w:r>
+        <w:rPr>
+          <w:rFonts w:ascii="Arial" w:hAnsi="Arial" w:cs="Arial"/>
+          <w:i/>
+          <w:iCs/>
+        </w:rPr>
+        <w:t xml:space="preserve"> de Linux</w:t>
       </w:r>
       <w:r>
         <w:rPr>
@@ -4335,7 +5158,39 @@
           <w:rFonts w:ascii="Arial" w:hAnsi="Arial" w:cs="Arial"/>
           <w:lang w:val="es-AR"/>
         </w:rPr>
-        <w:t xml:space="preserve">] Linux Foundation, “Documentación oficial del kernel de Linux,” 2024. [En línea]. Disponible en: </w:t>
+        <w:t xml:space="preserve">] Linux </w:t>
+      </w:r>
+      <w:proofErr w:type="spellStart"/>
+      <w:r>
+        <w:rPr>
+          <w:rFonts w:ascii="Arial" w:hAnsi="Arial" w:cs="Arial"/>
+          <w:lang w:val="es-AR"/>
+        </w:rPr>
+        <w:t>Foundation</w:t>
+      </w:r>
+      <w:proofErr w:type="spellEnd"/>
+      <w:r>
+        <w:rPr>
+          <w:rFonts w:ascii="Arial" w:hAnsi="Arial" w:cs="Arial"/>
+          <w:lang w:val="es-AR"/>
+        </w:rPr>
+        <w:t xml:space="preserve">, “Documentación oficial del </w:t>
+      </w:r>
+      <w:proofErr w:type="spellStart"/>
+      <w:r>
+        <w:rPr>
+          <w:rFonts w:ascii="Arial" w:hAnsi="Arial" w:cs="Arial"/>
+          <w:lang w:val="es-AR"/>
+        </w:rPr>
+        <w:t>kernel</w:t>
+      </w:r>
+      <w:proofErr w:type="spellEnd"/>
+      <w:r>
+        <w:rPr>
+          <w:rFonts w:ascii="Arial" w:hAnsi="Arial" w:cs="Arial"/>
+          <w:lang w:val="es-AR"/>
+        </w:rPr>
+        <w:t xml:space="preserve"> de Linux,” 2024. [En línea]. Disponible en: </w:t>
       </w:r>
       <w:hyperlink r:id="rId11" w:tgtFrame="_new" w:history="1">
         <w:r>
@@ -4362,7 +5217,23 @@
           <w:lang w:val="es-AR"/>
         </w:rPr>
         <w:lastRenderedPageBreak/>
-        <w:t xml:space="preserve">[3] Raspberry Pi 4b specifications. Disponible en: </w:t>
+        <w:t xml:space="preserve">[3] Raspberry Pi 4b </w:t>
+      </w:r>
+      <w:proofErr w:type="spellStart"/>
+      <w:r>
+        <w:rPr>
+          <w:rFonts w:ascii="Arial" w:hAnsi="Arial" w:cs="Arial"/>
+          <w:lang w:val="es-AR"/>
+        </w:rPr>
+        <w:t>specifications</w:t>
+      </w:r>
+      <w:proofErr w:type="spellEnd"/>
+      <w:r>
+        <w:rPr>
+          <w:rFonts w:ascii="Arial" w:hAnsi="Arial" w:cs="Arial"/>
+          <w:lang w:val="es-AR"/>
+        </w:rPr>
+        <w:t xml:space="preserve">. Disponible en: </w:t>
       </w:r>
       <w:hyperlink r:id="rId12" w:history="1">
         <w:r>
@@ -4402,7 +5273,23 @@
           <w:rFonts w:ascii="Arial" w:hAnsi="Arial" w:cs="Arial"/>
           <w:lang w:val="es-AR"/>
         </w:rPr>
-        <w:t xml:space="preserve">] FreeRTOS, “Documentación del kernel de FreeRTOS,” 2024. [En línea]. Disponible en: </w:t>
+        <w:t xml:space="preserve">] FreeRTOS, “Documentación del </w:t>
+      </w:r>
+      <w:proofErr w:type="spellStart"/>
+      <w:r>
+        <w:rPr>
+          <w:rFonts w:ascii="Arial" w:hAnsi="Arial" w:cs="Arial"/>
+          <w:lang w:val="es-AR"/>
+        </w:rPr>
+        <w:t>kernel</w:t>
+      </w:r>
+      <w:proofErr w:type="spellEnd"/>
+      <w:r>
+        <w:rPr>
+          <w:rFonts w:ascii="Arial" w:hAnsi="Arial" w:cs="Arial"/>
+          <w:lang w:val="es-AR"/>
+        </w:rPr>
+        <w:t xml:space="preserve"> de FreeRTOS,” 2024. [En línea]. Disponible en: </w:t>
       </w:r>
       <w:hyperlink r:id="rId13" w:tgtFrame="_new" w:history="1">
         <w:r>
@@ -4439,7 +5326,21 @@
         <w:rPr>
           <w:rFonts w:ascii="Arial" w:hAnsi="Arial" w:cs="Arial"/>
         </w:rPr>
-        <w:t xml:space="preserve">] Raspberry Pi Foundation, “Hoja de datos del RP2040,” 2021. [En línea]. Disponible en: </w:t>
+        <w:t xml:space="preserve">] Raspberry Pi </w:t>
+      </w:r>
+      <w:proofErr w:type="spellStart"/>
+      <w:r>
+        <w:rPr>
+          <w:rFonts w:ascii="Arial" w:hAnsi="Arial" w:cs="Arial"/>
+        </w:rPr>
+        <w:t>Foundation</w:t>
+      </w:r>
+      <w:proofErr w:type="spellEnd"/>
+      <w:r>
+        <w:rPr>
+          <w:rFonts w:ascii="Arial" w:hAnsi="Arial" w:cs="Arial"/>
+        </w:rPr>
+        <w:t xml:space="preserve">, “Hoja de datos del RP2040,” 2021. [En línea]. Disponible en: </w:t>
       </w:r>
       <w:hyperlink r:id="rId14" w:tgtFrame="_new" w:history="1">
         <w:r>
@@ -4475,7 +5376,49 @@
         <w:rPr>
           <w:rFonts w:ascii="Arial" w:hAnsi="Arial" w:cs="Arial"/>
         </w:rPr>
-        <w:t xml:space="preserve">] Flask, “Documentación del framework Flask,” 2024. [En línea]. Disponible en: </w:t>
+        <w:t xml:space="preserve">] </w:t>
+      </w:r>
+      <w:proofErr w:type="spellStart"/>
+      <w:r>
+        <w:rPr>
+          <w:rFonts w:ascii="Arial" w:hAnsi="Arial" w:cs="Arial"/>
+        </w:rPr>
+        <w:t>Flask</w:t>
+      </w:r>
+      <w:proofErr w:type="spellEnd"/>
+      <w:r>
+        <w:rPr>
+          <w:rFonts w:ascii="Arial" w:hAnsi="Arial" w:cs="Arial"/>
+        </w:rPr>
+        <w:t xml:space="preserve">, “Documentación del </w:t>
+      </w:r>
+      <w:proofErr w:type="spellStart"/>
+      <w:r>
+        <w:rPr>
+          <w:rFonts w:ascii="Arial" w:hAnsi="Arial" w:cs="Arial"/>
+        </w:rPr>
+        <w:t>framework</w:t>
+      </w:r>
+      <w:proofErr w:type="spellEnd"/>
+      <w:r>
+        <w:rPr>
+          <w:rFonts w:ascii="Arial" w:hAnsi="Arial" w:cs="Arial"/>
+        </w:rPr>
+        <w:t xml:space="preserve"> </w:t>
+      </w:r>
+      <w:proofErr w:type="spellStart"/>
+      <w:r>
+        <w:rPr>
+          <w:rFonts w:ascii="Arial" w:hAnsi="Arial" w:cs="Arial"/>
+        </w:rPr>
+        <w:t>Flask</w:t>
+      </w:r>
+      <w:proofErr w:type="spellEnd"/>
+      <w:r>
+        <w:rPr>
+          <w:rFonts w:ascii="Arial" w:hAnsi="Arial" w:cs="Arial"/>
+        </w:rPr>
+        <w:t xml:space="preserve">,” 2024. [En línea]. Disponible en: </w:t>
       </w:r>
       <w:hyperlink r:id="rId15" w:tgtFrame="_new" w:history="1">
         <w:r>
@@ -4539,7 +5482,6 @@
           <w:sz w:val="24"/>
           <w:lang w:val="es-AR"/>
         </w:rPr>
-        <w:lastRenderedPageBreak/>
         <w:t>ANEXOS</w:t>
       </w:r>
       <w:bookmarkEnd w:id="23"/>
@@ -4603,9 +5545,9 @@
           <w:lang w:val="es-AR"/>
         </w:rPr>
         <w:drawing>
-          <wp:inline distT="0" distB="0" distL="0" distR="0" wp14:anchorId="3AAF913E" wp14:editId="3B35978E">
-            <wp:extent cx="5573053" cy="7816132"/>
-            <wp:effectExtent l="0" t="0" r="8890" b="0"/>
+          <wp:inline distT="0" distB="0" distL="0" distR="0" wp14:anchorId="3AAF913E" wp14:editId="78CAC2A4">
+            <wp:extent cx="4508205" cy="6322697"/>
+            <wp:effectExtent l="0" t="0" r="6985" b="1905"/>
             <wp:docPr id="1123071540" name="Imagen 3"/>
             <wp:cNvGraphicFramePr>
               <a:graphicFrameLocks xmlns:a="http://schemas.openxmlformats.org/drawingml/2006/main" noChangeAspect="1"/>
@@ -4635,7 +5577,7 @@
                   <pic:spPr bwMode="auto">
                     <a:xfrm>
                       <a:off x="0" y="0"/>
-                      <a:ext cx="5576502" cy="7820969"/>
+                      <a:ext cx="4516438" cy="6334243"/>
                     </a:xfrm>
                     <a:prstGeom prst="rect">
                       <a:avLst/>
@@ -4650,6 +5592,13 @@
             </a:graphic>
           </wp:inline>
         </w:drawing>
+      </w:r>
+      <w:r>
+        <w:rPr>
+          <w:rFonts w:ascii="Arial" w:hAnsi="Arial" w:cs="Arial"/>
+          <w:lang w:val="es-AR"/>
+        </w:rPr>
+        <w:t xml:space="preserve">     </w:t>
       </w:r>
     </w:p>
     <w:p>
@@ -5388,7 +6337,7 @@
         </mc:Choice>
         <mc:Fallback>
           <w:pict>
-            <v:shapetype w14:anchorId="421F9580" id="_x0000_t32" coordsize="21600,21600" o:spt="32" o:oned="t" path="m,l21600,21600e" filled="f">
+            <v:shapetype w14:anchorId="79045A2A" id="_x0000_t32" coordsize="21600,21600" o:spt="32" o:oned="t" path="m,l21600,21600e" filled="f">
               <v:path arrowok="t" fillok="f" o:connecttype="none"/>
               <o:lock v:ext="edit" shapetype="t"/>
             </v:shapetype>

</xml_diff>